<commit_message>
Link course materials to central lab portal
</commit_message>
<xml_diff>
--- a/courseware/LG-TGS-2020503264-Data Mining and Machine Learning Fundamentals for Beginners-v17.0.docx
+++ b/courseware/LG-TGS-2020503264-Data Mining and Machine Learning Fundamentals for Beginners-v17.0.docx
@@ -500,7 +500,19 @@
         <w:pStyle w:val="ListNumber"/>
       </w:pPr>
       <w:r>
-        <w:t>Open http://localhost:8501 and upload the dataset from the current lab folder.</w:t>
+        <w:t xml:space="preserve">Open the </w:t>
+      </w:r>
+      <w:hyperlink r:id="rId11">
+        <w:r>
+          <w:rPr>
+            <w:color w:val="1E40AF"/>
+            <w:u w:val="single"/>
+          </w:rPr>
+          <w:t>Central Lab Portal</w:t>
+        </w:r>
+      </w:hyperlink>
+      <w:r>
+        <w:t>, confirm the workflow and dataset, then open http://localhost:8501 and upload the dataset from the current lab folder.</w:t>
       </w:r>
     </w:p>
     <w:p>

</xml_diff>